<commit_message>
Add spatial evidence multipanel figure for Atera uRNA
</commit_message>
<xml_diff>
--- a/manuscripts/atera_urna_nature_methods/manuscript_draft.docx
+++ b/manuscripts/atera_urna_nature_methods/manuscript_draft.docx
@@ -212,6 +212,14 @@
     </w:p>
     <w:p>
       <w:pPr>
+        <w:spacing w:after="120"/>
+      </w:pPr>
+      <w:r>
+        <w:t>To verify that these COSTE proximity calls corresponded to real spatial arrangements rather than only matrix-level statistics, we generated local position maps for selected examples. For CCND1, C1QA, JCHAIN and CDH5, the plotted uRNAs overlapped the corresponding 11q13 tumor, macrophage, plasma-cell and endothelial landmarks in 850-um windows chosen from the true transcript and cell-coordinate data (Fig. 5a-d). The same examples were highlighted in the uRNA-only SSS heatmap and global concordance distribution, showing that their local spatial patterns matched their low-SSS target cell groups and high all-transcript concordance (Fig. 5f-i). ERBB2 was included as a discordant example: its uRNAs were closest to CXCL14+ fibroblasts in the uRNA-only analysis, whereas its all-transcript profile favored basal-like structured DCIS cells (Fig. 5e-i).</w:t>
+      </w:r>
+    </w:p>
+    <w:p>
+      <w:pPr>
         <w:pStyle w:val="Heading2"/>
       </w:pPr>
       <w:r>
@@ -415,6 +423,22 @@
         <w:pStyle w:val="Heading2"/>
       </w:pPr>
       <w:r>
+        <w:t>Spatial example windows</w:t>
+      </w:r>
+    </w:p>
+    <w:p>
+      <w:pPr>
+        <w:spacing w:after="120"/>
+      </w:pPr>
+      <w:r>
+        <w:t>Spatial example windows were extracted from the cached uRNA-coordinate parquet file generated on the A100 server. We selected CCND1, C1QA, JCHAIN and CDH5 as concordant examples and ERBB2 as a discordant example. For each gene, an 850-um square window was chosen by scoring grid bins for joint enrichment of the gene's uRNA coordinates and the target cell group. Target groups were 11q13 invasive tumor cells for CCND1, macrophages for C1QA, plasma cells for JCHAIN, endothelial cells for CDH5 and CXCL14+ fibroblasts for ERBB2. The Figure 5 maps show true uRNA coordinates, true target cell centroids and sampled non-target cell centroids from each selected window. To maintain readability, uRNAs were downsampled to at most 7,000 plotted points per example and non-target cells to at most 3,500 plotted points; all target cells in the window were retained.</w:t>
+      </w:r>
+    </w:p>
+    <w:p>
+      <w:pPr>
+        <w:pStyle w:val="Heading2"/>
+      </w:pPr>
+      <w:r>
         <w:t>Statistics and visualization</w:t>
       </w:r>
     </w:p>
@@ -576,6 +600,22 @@
       </w:pPr>
       <w:r>
         <w:t>Left, genes with the lowest Spearman concordance between uRNA-only and all-transcript SSS profiles. Right, uRNA fraction and uRNA count for low-concordance genes, showing that discordance is not explained only by low molecular coverage.</w:t>
+      </w:r>
+    </w:p>
+    <w:p>
+      <w:pPr>
+        <w:pStyle w:val="Heading2"/>
+      </w:pPr>
+      <w:r>
+        <w:t>Figure 5. Real spatial examples support uRNA-only COSTE calls</w:t>
+      </w:r>
+    </w:p>
+    <w:p>
+      <w:pPr>
+        <w:spacing w:after="120"/>
+      </w:pPr>
+      <w:r>
+        <w:t>a-e, True spatial windows for CCND1, C1QA, JCHAIN, CDH5 and ERBB2. Black points are high-quality uRNAs for the plotted gene, open colored circles are the target cell group and pale gray points are other cells in the same 850-um window. f, uRNA-only COSTE proximity for the five examples and representative cell groups, plotted as 1 - SSS so higher values indicate closer proximity. White boxes mark the plotted target cell group. g, Global distribution of Spearman concordance between uRNA-only and all-transcript SSS profiles, with selected examples highlighted. h, Marker group validation summary. i, Per-example statistics, including uRNA-only SSS, concordance, best-cell-group match and the uRNA-only versus all-transcript best cell group.</w:t>
       </w:r>
     </w:p>
     <w:p>

</xml_diff>

<commit_message>
Add whole-section overview to Atera spatial evidence figure
</commit_message>
<xml_diff>
--- a/manuscripts/atera_urna_nature_methods/manuscript_draft.docx
+++ b/manuscripts/atera_urna_nature_methods/manuscript_draft.docx
@@ -215,7 +215,7 @@
         <w:spacing w:after="120"/>
       </w:pPr>
       <w:r>
-        <w:t>To verify that these COSTE proximity calls corresponded to real spatial arrangements rather than only matrix-level statistics, we generated local position maps for selected examples. For CCND1, C1QA, JCHAIN and CDH5, the plotted uRNAs overlapped the corresponding 11q13 tumor, macrophage, plasma-cell and endothelial landmarks in 850-um windows chosen from the true transcript and cell-coordinate data (Fig. 5a-d). The same examples were highlighted in the uRNA-only SSS heatmap and global concordance distribution, showing that their local spatial patterns matched their low-SSS target cell groups and high all-transcript concordance (Fig. 5f-i). ERBB2 was included as a discordant example: its uRNAs were closest to CXCL14+ fibroblasts in the uRNA-only analysis, whereas its all-transcript profile favored basal-like structured DCIS cells (Fig. 5e-i).</w:t>
+        <w:t>To verify that these COSTE proximity calls corresponded to real spatial arrangements rather than only matrix-level statistics, we generated local position maps for selected examples. A whole-section overview first marks the five sampled windows, and the corresponding zoom panels then show the true uRNA and cell-centroid positions (Fig. 5a-f). For CCND1, C1QA, JCHAIN and CDH5, the plotted uRNAs overlapped the corresponding 11q13 tumor, macrophage, plasma-cell and endothelial landmarks in 850-um windows chosen from the true transcript and cell-coordinate data. The same examples were highlighted in the uRNA-only SSS heatmap and global concordance distribution, showing that their local spatial patterns matched their low-SSS target cell groups and high all-transcript concordance (Fig. 5g-j). ERBB2 was included as a discordant example: its uRNAs were closest to CXCL14+ fibroblasts in the uRNA-only analysis, whereas its all-transcript profile favored basal-like structured DCIS cells (Fig. 5f-j).</w:t>
       </w:r>
     </w:p>
     <w:p>
@@ -431,7 +431,7 @@
         <w:spacing w:after="120"/>
       </w:pPr>
       <w:r>
-        <w:t>Spatial example windows were extracted from the cached uRNA-coordinate parquet file generated on the A100 server. We selected CCND1, C1QA, JCHAIN and CDH5 as concordant examples and ERBB2 as a discordant example. For each gene, an 850-um square window was chosen by scoring grid bins for joint enrichment of the gene's uRNA coordinates and the target cell group. Target groups were 11q13 invasive tumor cells for CCND1, macrophages for C1QA, plasma cells for JCHAIN, endothelial cells for CDH5 and CXCL14+ fibroblasts for ERBB2. The Figure 5 maps show true uRNA coordinates, true target cell centroids and sampled non-target cell centroids from each selected window. To maintain readability, uRNAs were downsampled to at most 7,000 plotted points per example and non-target cells to at most 3,500 plotted points; all target cells in the window were retained.</w:t>
+        <w:t>Spatial example windows were extracted from the cached uRNA-coordinate parquet file generated on the A100 server. We selected CCND1, C1QA, JCHAIN and CDH5 as concordant examples and ERBB2 as a discordant example. For each gene, an 850-um square window was chosen by scoring grid bins for joint enrichment of the gene's uRNA coordinates and the target cell group. Target groups were 11q13 invasive tumor cells for CCND1, macrophages for C1QA, plasma cells for JCHAIN, endothelial cells for CDH5 and CXCL14+ fibroblasts for ERBB2. The Figure 5 overview uses a reproducible sample of 120,000 annotated cell centroids to show where the windows sit in the whole section. The zoom maps show true uRNA coordinates, true target cell centroids and sampled non-target cell centroids from each selected window. To maintain readability, uRNAs were downsampled to at most 7,000 plotted points per example and non-target cells to at most 3,500 plotted points; all target cells in the window were retained.</w:t>
       </w:r>
     </w:p>
     <w:p>
@@ -615,7 +615,7 @@
         <w:spacing w:after="120"/>
       </w:pPr>
       <w:r>
-        <w:t>a-e, True spatial windows for CCND1, C1QA, JCHAIN, CDH5 and ERBB2. Black points are high-quality uRNAs for the plotted gene, open colored circles are the target cell group and pale gray points are other cells in the same 850-um window. f, uRNA-only COSTE proximity for the five examples and representative cell groups, plotted as 1 - SSS so higher values indicate closer proximity. White boxes mark the plotted target cell group. g, Global distribution of Spearman concordance between uRNA-only and all-transcript SSS profiles, with selected examples highlighted. h, Marker group validation summary. i, Per-example statistics, including uRNA-only SSS, concordance, best-cell-group match and the uRNA-only versus all-transcript best cell group.</w:t>
+        <w:t>a, Whole-section overview of sampled cell centroids with colored boxes marking the five 850-um windows. b-f, True spatial windows for CCND1, C1QA, JCHAIN, CDH5 and ERBB2. Black points are high-quality uRNAs for the plotted gene, open colored circles are the target cell group and pale gray points are other cells in the same window. g, uRNA-only COSTE proximity for the five examples and representative cell groups, plotted as 1 - SSS so higher values indicate closer proximity. White boxes mark the plotted target cell group. h, Global distribution of Spearman concordance between uRNA-only and all-transcript SSS profiles, with selected examples highlighted. i, Marker group validation summary. j, Per-example statistics, including uRNA-only SSS, concordance, best-cell-group match and the uRNA-only versus all-transcript best cell group.</w:t>
       </w:r>
     </w:p>
     <w:p>

</xml_diff>

<commit_message>
Reorganize Atera lead-in figures
</commit_message>
<xml_diff>
--- a/manuscripts/atera_urna_nature_methods/manuscript_draft.docx
+++ b/manuscripts/atera_urna_nature_methods/manuscript_draft.docx
@@ -119,7 +119,7 @@
         <w:spacing w:after="120"/>
       </w:pPr>
       <w:r>
-        <w:t>The uRNA pool was broad rather than restricted to a few genes. At least one high-quality uRNA was detected for 18,023 of 18,028 genes, corresponding to 99.97% of the panel. The median gene-level uRNA fraction across the full panel was 0.160. The distribution was not uniform: highly expressed and spatially abundant genes such as CCND1, NHERF1, XBP1 and OR4F17 contributed hundreds of thousands of high-quality uRNAs, whereas many genes had lower but still non-zero uRNA support (Fig. 1b,c). This scale makes the dataset suitable for testing whether uRNAs retain gene-specific tissue structure.</w:t>
+        <w:t>The uRNA pool was broad rather than restricted to a few genes. At least one high-quality uRNA was detected for 18,023 of 18,028 genes, corresponding to 99.97% of the panel. The median gene-level uRNA fraction across the full panel was 0.160. The distribution was not uniform: highly expressed and spatially abundant genes such as CCND1, NHERF1, XBP1 and OR4F17 contributed hundreds of thousands of high-quality uRNAs, whereas many genes had lower but still non-zero uRNA support (Fig. 1c,d). This scale makes the dataset suitable for testing whether uRNAs retain gene-specific tissue structure.</w:t>
       </w:r>
     </w:p>
     <w:p>
@@ -127,7 +127,7 @@
         <w:spacing w:after="120"/>
       </w:pPr>
       <w:r>
-        <w:t>To avoid over-interpreting sparse genes, we selected the top 500 genes by high-quality uRNA count and added curated marker genes for interpretable breast cancer compartments. This produced 530 genes for uRNA-only COSTE analysis. For each gene, uRNA coordinates were treated as a separate spatial population, and COSTE computed SSS values between that gene population and each annotated cell group. Lower SSS indicates closer spatial proximity in the COSTE hierarchy. This design uses cell-group coordinates as reference landmarks but does not assign uRNAs to cells.</w:t>
+        <w:t>To avoid over-interpreting sparse genes, we selected the top 500 genes by high-quality uRNA count and added curated marker genes for interpretable breast cancer compartments. This produced 530 genes for uRNA-only COSTE analysis (Fig. 1b). For each gene, uRNA coordinates were treated as a separate spatial population, and COSTE computed SSS values between that gene population and each annotated cell group. Lower SSS indicates closer spatial proximity in the COSTE hierarchy. This design uses cell-group coordinates as reference landmarks but does not assign uRNAs to cells. Thus, all-panel summaries describe the 18,028 assayed genes, whereas COSTE and concordance results refer to the 530 analyzed genes.</w:t>
       </w:r>
     </w:p>
     <w:p>
@@ -135,7 +135,7 @@
         <w:spacing w:after="120"/>
       </w:pPr>
       <w:r>
-        <w:t>The resulting uRNA-only best-cell-group calls were concentrated in expected high-density tissue compartments. Basal-like structured DCIS cells and CXCL14+ fibroblasts each were the closest cell group for 189 genes, followed by macrophages for 100 genes, endothelial cells for 16 genes and pericytes for 8 genes (Fig. 1d). This distribution indicates that uRNAs carry strong compartmental structure but also warns that high-density stromal and interface regions can dominate global uRNA topology.</w:t>
+        <w:t>The resulting uRNA-only best-cell-group calls were concentrated in expected high-density tissue compartments. Basal-like structured DCIS cells and CXCL14+ fibroblasts each were the closest cell group for 189 genes, followed by macrophages for 100 genes, endothelial cells for 16 genes and pericytes for 8 genes (Fig. 2a). This distribution indicates that uRNAs carry strong compartmental structure but also warns that high-density stromal and interface regions can dominate global uRNA topology.</w:t>
       </w:r>
     </w:p>
     <w:p>
@@ -151,7 +151,7 @@
         <w:spacing w:after="120"/>
       </w:pPr>
       <w:r>
-        <w:t>We next compared uRNA-only SSS profiles with all-transcript gene-to-cell SSS profiles previously generated from the same sample. Across the 530 analyzed genes, the median per-gene Spearman concordance was 0.649, with an interquartile range of 0.226 to 0.998 and a mean of 0.555 (Fig. 2a,b). Exact best-cell-group agreement between uRNA-only and all-transcript profiles occurred for 50.2% of genes. In total, 60.0% of genes had Spearman concordance &gt;= 0.5, 37.7% had concordance &gt;= 0.8 and 21.9% had concordance effectively equal to 1.0 (Fig. 2c).</w:t>
+        <w:t>We next compared uRNA-only SSS profiles with all-transcript gene-to-cell SSS profiles previously generated from the same sample. Across the 530 analyzed genes, the median per-gene Spearman concordance was 0.649, with an interquartile range of 0.226 to 0.998 and a mean of 0.555 (Fig. 2b,c). Exact best-cell-group agreement between uRNA-only and all-transcript profiles occurred for 50.2% of genes. In total, 60.0% of genes had Spearman concordance &gt;= 0.5, 37.7% had concordance &gt;= 0.8 and 21.9% had concordance effectively equal to 1.0 (Fig. 2d).</w:t>
       </w:r>
     </w:p>
     <w:p>
@@ -215,7 +215,7 @@
         <w:spacing w:after="120"/>
       </w:pPr>
       <w:r>
-        <w:t>To verify that these COSTE proximity calls corresponded to real spatial arrangements rather than only matrix-level statistics, we generated local position maps for selected examples. A whole-section overview first marks the five sampled windows, and the corresponding zoom panels then show the true uRNA and cell-centroid positions (Fig. 5a-f). For CCND1, C1QA, JCHAIN and CDH5, the plotted uRNAs overlapped the corresponding 11q13 tumor, macrophage, plasma-cell and endothelial landmarks in 850-um windows chosen from the true transcript and cell-coordinate data. The same examples were highlighted in the uRNA-only SSS heatmap and global concordance distribution, showing that their local spatial patterns matched their low-SSS target cell groups and high all-transcript concordance (Fig. 5g-j). ERBB2 was included as a discordant example: its uRNAs were closest to CXCL14+ fibroblasts in the uRNA-only analysis, whereas its all-transcript profile favored basal-like structured DCIS cells (Fig. 5f-j).</w:t>
+        <w:t>To verify that these COSTE proximity calls corresponded to real spatial arrangements rather than only matrix-level statistics, we generated local position maps for selected examples. The selection path first moved from the 18,028-gene panel to the 530-gene uRNA-only COSTE analysis, then to curated marker controls with interpretable expected compartments, and finally to four concordant positive examples plus one discordant boundary-sensitive control (Fig. 4). A whole-section overview first marks the five sampled windows, and the corresponding zoom panels then show the true uRNA and cell-centroid positions (Fig. 5a-f). For CCND1, C1QA, JCHAIN and CDH5, the plotted uRNAs overlapped the corresponding 11q13 tumor, macrophage, plasma-cell and endothelial landmarks in 850-um windows chosen from the true transcript and cell-coordinate data. The same examples were highlighted in the uRNA-only SSS heatmap and global concordance distribution, showing that their local spatial patterns matched their low-SSS target cell groups and high all-transcript concordance (Fig. 5g-j). ERBB2 was included as a discordant example: its uRNAs were closest to CXCL14+ fibroblasts in the uRNA-only analysis, whereas its all-transcript profile favored basal-like structured DCIS cells (Fig. 4d and Fig. 5f-j).</w:t>
       </w:r>
     </w:p>
     <w:p>
@@ -231,7 +231,7 @@
         <w:spacing w:after="120"/>
       </w:pPr>
       <w:r>
-        <w:t>The strongest argument for using uRNAs as a diagnostic is not that every uRNA-only profile matches the all-transcript profile. It is that discordance is interpretable and actionable. Some genes with substantial uRNA support showed low or negative Spearman concordance with all-transcript SSS profiles (Fig. 4). These discordant genes were not simply the lowest-coverage cases; several had tens to hundreds of thousands of high-quality uRNAs and uRNA fractions in the range observed for well-concordant genes.</w:t>
+        <w:t>The strongest argument for using uRNAs as a diagnostic is not that every uRNA-only profile matches the all-transcript profile. It is that discordance is interpretable and actionable. Some genes with substantial uRNA support showed low or negative Spearman concordance with all-transcript SSS profiles (Supplementary Fig. 1). These discordant genes were not simply the lowest-coverage cases; several had tens to hundreds of thousands of high-quality uRNAs and uRNA fractions in the range observed for well-concordant genes.</w:t>
       </w:r>
     </w:p>
     <w:p>
@@ -543,7 +543,7 @@
         <w:pStyle w:val="Heading2"/>
       </w:pPr>
       <w:r>
-        <w:t>Figure 1. Dataset scale and uRNA-only COSTE attribution</w:t>
+        <w:t>Figure 1. Dataset scale and analysis universe</w:t>
       </w:r>
     </w:p>
     <w:p>
@@ -551,7 +551,7 @@
         <w:spacing w:after="120"/>
       </w:pPr>
       <w:r>
-        <w:t>a, Transcript counts through gene, quality and uRNA filtering. b, Distribution of gene-level uRNA fractions across 18,028 genes. The vertical line marks the median. c, Top genes by high-quality uRNA count. d, uRNA-only best COSTE cell groups for the 530 analyzed genes.</w:t>
+        <w:t>a, Transcript counts through gene, quality and uRNA filtering. b, Analysis-set definition from the 18,028-gene panel to the 530 genes analyzed by uRNA-only COSTE. c, Distribution of gene-level uRNA fractions across all panel genes, with the 530 analyzed genes overlaid. d, Top genes by high-quality uRNA count.</w:t>
       </w:r>
     </w:p>
     <w:p>
@@ -559,7 +559,7 @@
         <w:pStyle w:val="Heading2"/>
       </w:pPr>
       <w:r>
-        <w:t>Figure 2. Concordance between uRNA-only and all-transcript SSS profiles</w:t>
+        <w:t>Figure 2. uRNA-only COSTE attribution and concordance</w:t>
       </w:r>
     </w:p>
     <w:p>
@@ -567,7 +567,7 @@
         <w:spacing w:after="120"/>
       </w:pPr>
       <w:r>
-        <w:t>a, Relationship between gene-level uRNA count and Spearman concordance with all-transcript SSS. Blue points indicate genes with matching best cell groups; red points indicate non-matching best cell groups. b, Distribution of per-gene Spearman concordance. c, Fraction of genes meeting best-cluster and concordance thresholds. d, Module-level count and median concordance summaries.</w:t>
+        <w:t>a, uRNA-only best COSTE cell groups for the 530 analyzed genes. b, Relationship between gene-level uRNA count and Spearman concordance with all-transcript SSS. Blue points indicate genes with matching best cell groups; red points indicate non-matching best cell groups. c, Distribution of per-gene Spearman concordance. d, Fraction of genes meeting best-cluster and concordance thresholds.</w:t>
       </w:r>
     </w:p>
     <w:p>
@@ -583,7 +583,7 @@
         <w:spacing w:after="120"/>
       </w:pPr>
       <w:r>
-        <w:t>Heatmap of uRNA-only COSTE proximity for curated markers and representative cell groups. Values show 1 - SSS, so higher values indicate closer COSTE proximity. Tumor, basal-like DCIS, macrophage, plasma-cell, rare epithelial and vascular markers recover expected compartments from uRNA coordinates alone.</w:t>
+        <w:t>Heatmap and summaries of uRNA-only COSTE proximity for curated marker groups. a, Median 1 - SSS values for marker groups and representative cell groups; black boxes mark expected compartments. b, Marker group concordance and best-cluster match rates. c, Concordant marker groups selected as positive controls for spatial validation.</w:t>
       </w:r>
     </w:p>
     <w:p>
@@ -591,7 +591,7 @@
         <w:pStyle w:val="Heading2"/>
       </w:pPr>
       <w:r>
-        <w:t>Figure 4. Discordant genes nominate segmentation-sensitive signals</w:t>
+        <w:t>Figure 4. Selection rationale for spatial validation examples</w:t>
       </w:r>
     </w:p>
     <w:p>
@@ -599,7 +599,7 @@
         <w:spacing w:after="120"/>
       </w:pPr>
       <w:r>
-        <w:t>Left, genes with the lowest Spearman concordance between uRNA-only and all-transcript SSS profiles. Right, uRNA fraction and uRNA count for low-concordance genes, showing that discordance is not explained only by low molecular coverage.</w:t>
+        <w:t>a, Selection path from the full 18,028-gene panel to the 530 uRNA-only COSTE genes, curated marker controls and five spatial examples. b, Median uRNA support for the marker groups represented in the spatial examples. c, uRNA-only COSTE proximity for the five selected examples and representative target cell groups. d, Per-gene evidence carried into the spatial validation figure, including uRNA count, uRNA fraction, target proximity, concordance and match status.</w:t>
       </w:r>
     </w:p>
     <w:p>
@@ -615,7 +615,7 @@
         <w:spacing w:after="120"/>
       </w:pPr>
       <w:r>
-        <w:t>a, Whole-section overview of sampled cell centroids with colored boxes marking the five 850-um windows. b-f, True spatial windows for CCND1, C1QA, JCHAIN, CDH5 and ERBB2. Black points are high-quality uRNAs for the plotted gene, open colored circles are the target cell group and pale gray points are other cells in the same window. g, uRNA-only COSTE proximity for the five examples and representative cell groups, plotted as 1 - SSS so higher values indicate closer proximity. White boxes mark the plotted target cell group. h, Global distribution of Spearman concordance between uRNA-only and all-transcript SSS profiles, with selected examples highlighted. i, Marker group validation summary. j, Per-example statistics, including uRNA-only SSS, concordance, best-cell-group match and the uRNA-only versus all-transcript best cell group.</w:t>
+        <w:t>a, Whole-section overview of sampled cell centroids with colored boxes marking the five 850-um windows. b-f, True spatial windows for CCND1, C1QA, JCHAIN, CDH5 and ERBB2. Black points are high-quality uRNAs for the plotted gene, open colored circles are the target cell group and pale gray points are other cells in the same window. g, uRNA-only COSTE proximity for the five examples and representative cell groups, plotted as 1 - SSS so higher values indicate closer proximity. Black boxes mark the plotted target cell group. h, Global distribution of Spearman concordance between uRNA-only and all-transcript SSS profiles, with selected examples highlighted. i, Marker group validation summary. j, Per-example statistics, including uRNA-only SSS, concordance, best-cell-group match and the uRNA-only versus all-transcript best cell group.</w:t>
       </w:r>
     </w:p>
     <w:p>

</xml_diff>

<commit_message>
Combine Atera lead-in figures
</commit_message>
<xml_diff>
--- a/manuscripts/atera_urna_nature_methods/manuscript_draft.docx
+++ b/manuscripts/atera_urna_nature_methods/manuscript_draft.docx
@@ -111,7 +111,7 @@
         <w:spacing w:after="120"/>
       </w:pPr>
       <w:r>
-        <w:t>The Atera breast cancer dataset contains 170,057 detected cells and 18,028 genes in a human FFPE breast cancer section with annotated tumor, stromal, immune and rare epithelial compartments [9]. The transcript table contained 740,442,119 rows, including 738,289,569 gene rows. After applying a quality threshold of QV &gt;= 20, 624,095,990 gene transcripts remained. Of these, 122,716,153 transcripts were assigned to the UNASSIGNED cell identifier, representing 19.7% of high-quality gene transcripts (Fig. 1a).</w:t>
+        <w:t>The Atera breast cancer dataset contains 170,057 detected cells and 18,028 genes in a human FFPE breast cancer section with annotated tumor, stromal, immune and rare epithelial compartments [9]. The transcript table contained 740,442,119 rows, including 738,289,569 gene rows. After applying a quality threshold of QV &gt;= 20, 624,095,990 gene transcripts remained. Of these, 122,716,153 transcripts were assigned to the UNASSIGNED cell identifier, representing 19.7% of high-quality gene transcripts (Fig. 4a).</w:t>
       </w:r>
     </w:p>
     <w:p>
@@ -119,7 +119,7 @@
         <w:spacing w:after="120"/>
       </w:pPr>
       <w:r>
-        <w:t>The uRNA pool was broad rather than restricted to a few genes. At least one high-quality uRNA was detected for 18,023 of 18,028 genes, corresponding to 99.97% of the panel. The median gene-level uRNA fraction across the full panel was 0.160. The distribution was not uniform: highly expressed and spatially abundant genes such as CCND1, NHERF1, XBP1 and OR4F17 contributed hundreds of thousands of high-quality uRNAs, whereas many genes had lower but still non-zero uRNA support (Fig. 1c,d). This scale makes the dataset suitable for testing whether uRNAs retain gene-specific tissue structure.</w:t>
+        <w:t>The uRNA pool was broad rather than restricted to a few genes. At least one high-quality uRNA was detected for 18,023 of 18,028 genes, corresponding to 99.97% of the panel. The median gene-level uRNA fraction across the full panel was 0.160. The distribution was not uniform: highly expressed and spatially abundant genes such as CCND1, NHERF1, XBP1 and OR4F17 contributed hundreds of thousands of high-quality uRNAs, whereas many genes had lower but still non-zero uRNA support (Fig. 4c). This scale makes the dataset suitable for testing whether uRNAs retain gene-specific tissue structure.</w:t>
       </w:r>
     </w:p>
     <w:p>
@@ -127,7 +127,7 @@
         <w:spacing w:after="120"/>
       </w:pPr>
       <w:r>
-        <w:t>To avoid over-interpreting sparse genes, we selected the top 500 genes by high-quality uRNA count and added curated marker genes for interpretable breast cancer compartments. This produced 530 genes for uRNA-only COSTE analysis (Fig. 1b). For each gene, uRNA coordinates were treated as a separate spatial population, and COSTE computed SSS values between that gene population and each annotated cell group. Lower SSS indicates closer spatial proximity in the COSTE hierarchy. This design uses cell-group coordinates as reference landmarks but does not assign uRNAs to cells. Thus, all-panel summaries describe the 18,028 assayed genes, whereas COSTE and concordance results refer to the 530 analyzed genes.</w:t>
+        <w:t>To avoid over-interpreting sparse genes, we selected the top 500 genes by high-quality uRNA count and added curated marker genes for interpretable breast cancer compartments. This produced 530 genes for uRNA-only COSTE analysis (Fig. 4b). For each gene, uRNA coordinates were treated as a separate spatial population, and COSTE computed SSS values between that gene population and each annotated cell group. Lower SSS indicates closer spatial proximity in the COSTE hierarchy. This design uses cell-group coordinates as reference landmarks but does not assign uRNAs to cells. Thus, all-panel summaries describe the 18,028 assayed genes, whereas COSTE and concordance results refer to the 530 analyzed genes.</w:t>
       </w:r>
     </w:p>
     <w:p>
@@ -135,7 +135,7 @@
         <w:spacing w:after="120"/>
       </w:pPr>
       <w:r>
-        <w:t>The resulting uRNA-only best-cell-group calls were concentrated in expected high-density tissue compartments. Basal-like structured DCIS cells and CXCL14+ fibroblasts each were the closest cell group for 189 genes, followed by macrophages for 100 genes, endothelial cells for 16 genes and pericytes for 8 genes (Fig. 2a). This distribution indicates that uRNAs carry strong compartmental structure but also warns that high-density stromal and interface regions can dominate global uRNA topology.</w:t>
+        <w:t>The resulting uRNA-only best-cell-group calls were concentrated in expected high-density tissue compartments. Basal-like structured DCIS cells and CXCL14+ fibroblasts each were the closest cell group for 189 genes, followed by macrophages for 100 genes, endothelial cells for 16 genes and pericytes for 8 genes (Fig. 4d). This distribution indicates that uRNAs carry strong compartmental structure but also warns that high-density stromal and interface regions can dominate global uRNA topology.</w:t>
       </w:r>
     </w:p>
     <w:p>
@@ -151,7 +151,7 @@
         <w:spacing w:after="120"/>
       </w:pPr>
       <w:r>
-        <w:t>We next compared uRNA-only SSS profiles with all-transcript gene-to-cell SSS profiles previously generated from the same sample. Across the 530 analyzed genes, the median per-gene Spearman concordance was 0.649, with an interquartile range of 0.226 to 0.998 and a mean of 0.555 (Fig. 2b,c). Exact best-cell-group agreement between uRNA-only and all-transcript profiles occurred for 50.2% of genes. In total, 60.0% of genes had Spearman concordance &gt;= 0.5, 37.7% had concordance &gt;= 0.8 and 21.9% had concordance effectively equal to 1.0 (Fig. 2d).</w:t>
+        <w:t>We next compared uRNA-only SSS profiles with all-transcript gene-to-cell SSS profiles previously generated from the same sample. Across the 530 analyzed genes, the median per-gene Spearman concordance was 0.649, with an interquartile range of 0.226 to 0.998 and a mean of 0.555 (Fig. 4e). Exact best-cell-group agreement between uRNA-only and all-transcript profiles occurred for 50.2% of genes. In total, 60.0% of genes had Spearman concordance &gt;= 0.5, 37.7% had concordance &gt;= 0.8 and 21.9% had concordance effectively equal to 1.0 (Fig. 4e).</w:t>
       </w:r>
     </w:p>
     <w:p>
@@ -183,7 +183,7 @@
         <w:spacing w:after="120"/>
       </w:pPr>
       <w:r>
-        <w:t>Curated marker genes provided positive controls with interpretable expected compartments. The 11q13 marker group, including CCND1, ELOVL2, KCNJ3 and FGF19, localized to 11q13 invasive tumor cells in the uRNA-only SSS profiles. The median Spearman concordance between uRNA-only and all-transcript profiles for this marker group was 0.999, and all four genes matched the all-transcript best cell group (Fig. 3).</w:t>
+        <w:t>Curated marker genes provided positive controls with interpretable expected compartments. The 11q13 marker group, including CCND1, ELOVL2, KCNJ3 and FGF19, localized to 11q13 invasive tumor cells in the uRNA-only SSS profiles. The median Spearman concordance between uRNA-only and all-transcript profiles for this marker group was 0.999, and all four genes matched the all-transcript best cell group (Fig. 4f).</w:t>
       </w:r>
     </w:p>
     <w:p>
@@ -215,7 +215,7 @@
         <w:spacing w:after="120"/>
       </w:pPr>
       <w:r>
-        <w:t>To verify that these COSTE proximity calls corresponded to real spatial arrangements rather than only matrix-level statistics, we generated local position maps for selected examples. The selection path first moved from the 18,028-gene panel to the 530-gene uRNA-only COSTE analysis, then to curated marker controls with interpretable expected compartments, and finally to four concordant positive examples plus one discordant boundary-sensitive control (Fig. 4). A whole-section overview first marks the five sampled windows, and the corresponding zoom panels then show the true uRNA and cell-centroid positions (Fig. 5a-f). For CCND1, C1QA, JCHAIN and CDH5, the plotted uRNAs overlapped the corresponding 11q13 tumor, macrophage, plasma-cell and endothelial landmarks in 850-um windows chosen from the true transcript and cell-coordinate data. The same examples were highlighted in the uRNA-only SSS heatmap and global concordance distribution, showing that their local spatial patterns matched their low-SSS target cell groups and high all-transcript concordance (Fig. 5g-j). ERBB2 was included as a discordant example: its uRNAs were closest to CXCL14+ fibroblasts in the uRNA-only analysis, whereas its all-transcript profile favored basal-like structured DCIS cells (Fig. 4d and Fig. 5f-j).</w:t>
+        <w:t>To verify that these COSTE proximity calls corresponded to real spatial arrangements rather than only matrix-level statistics, we generated local position maps for selected examples. The selection path first moved from the 18,028-gene panel to the 530-gene uRNA-only COSTE analysis, then to curated marker controls with interpretable expected compartments, and finally to four concordant positive examples plus one discordant boundary-sensitive control (Fig. 4b,f,g). A whole-section overview first marks the five sampled windows, and the corresponding zoom panels then show the true uRNA and cell-centroid positions (Fig. 5a-f). For CCND1, C1QA, JCHAIN and CDH5, the plotted uRNAs overlapped the corresponding 11q13 tumor, macrophage, plasma-cell and endothelial landmarks in 850-um windows chosen from the true transcript and cell-coordinate data. The same examples were highlighted in the uRNA-only SSS heatmap and global concordance distribution, showing that their local spatial patterns matched their low-SSS target cell groups and high all-transcript concordance (Fig. 5g-j). ERBB2 was included as a discordant example: its uRNAs were closest to CXCL14+ fibroblasts in the uRNA-only analysis, whereas its all-transcript profile favored basal-like structured DCIS cells (Fig. 4g and Fig. 5f-j).</w:t>
       </w:r>
     </w:p>
     <w:p>
@@ -543,7 +543,7 @@
         <w:pStyle w:val="Heading2"/>
       </w:pPr>
       <w:r>
-        <w:t>Figure 1. Dataset scale and analysis universe</w:t>
+        <w:t>Figure 4. Integrated uRNA evidence chain before spatial validation</w:t>
       </w:r>
     </w:p>
     <w:p>
@@ -551,55 +551,7 @@
         <w:spacing w:after="120"/>
       </w:pPr>
       <w:r>
-        <w:t>a, Transcript counts through gene, quality and uRNA filtering. b, Analysis-set definition from the 18,028-gene panel to the 530 genes analyzed by uRNA-only COSTE. c, Distribution of gene-level uRNA fractions across all panel genes, with the 530 analyzed genes overlaid. d, Top genes by high-quality uRNA count.</w:t>
-      </w:r>
-    </w:p>
-    <w:p>
-      <w:pPr>
-        <w:pStyle w:val="Heading2"/>
-      </w:pPr>
-      <w:r>
-        <w:t>Figure 2. uRNA-only COSTE attribution and concordance</w:t>
-      </w:r>
-    </w:p>
-    <w:p>
-      <w:pPr>
-        <w:spacing w:after="120"/>
-      </w:pPr>
-      <w:r>
-        <w:t>a, uRNA-only best COSTE cell groups for the 530 analyzed genes. b, Relationship between gene-level uRNA count and Spearman concordance with all-transcript SSS. Blue points indicate genes with matching best cell groups; red points indicate non-matching best cell groups. c, Distribution of per-gene Spearman concordance. d, Fraction of genes meeting best-cluster and concordance thresholds.</w:t>
-      </w:r>
-    </w:p>
-    <w:p>
-      <w:pPr>
-        <w:pStyle w:val="Heading2"/>
-      </w:pPr>
-      <w:r>
-        <w:t>Figure 3. Curated marker validation</w:t>
-      </w:r>
-    </w:p>
-    <w:p>
-      <w:pPr>
-        <w:spacing w:after="120"/>
-      </w:pPr>
-      <w:r>
-        <w:t>Heatmap and summaries of uRNA-only COSTE proximity for curated marker groups. a, Median 1 - SSS values for marker groups and representative cell groups; black boxes mark expected compartments. b, Marker group concordance and best-cluster match rates. c, Concordant marker groups selected as positive controls for spatial validation.</w:t>
-      </w:r>
-    </w:p>
-    <w:p>
-      <w:pPr>
-        <w:pStyle w:val="Heading2"/>
-      </w:pPr>
-      <w:r>
-        <w:t>Figure 4. Selection rationale for spatial validation examples</w:t>
-      </w:r>
-    </w:p>
-    <w:p>
-      <w:pPr>
-        <w:spacing w:after="120"/>
-      </w:pPr>
-      <w:r>
-        <w:t>a, Selection path from the full 18,028-gene panel to the 530 uRNA-only COSTE genes, curated marker controls and five spatial examples. b, Median uRNA support for the marker groups represented in the spatial examples. c, uRNA-only COSTE proximity for the five selected examples and representative target cell groups. d, Per-gene evidence carried into the spatial validation figure, including uRNA count, uRNA fraction, target proximity, concordance and match status.</w:t>
+        <w:t>a, Transcript counts through gene, quality and uRNA filtering. b, Analysis-set definition from the 18,028-gene panel to the 530 genes analyzed by uRNA-only COSTE and concordance. c, Distribution of gene-level uRNA fractions across all panel genes, with the 530 analyzed genes overlaid. d, uRNA-only best COSTE cell groups for the 530 analyzed genes. e, Compact summary of global concordance between uRNA-only and all-transcript SSS profiles across the 530 analyzed genes. f, Curated marker-control logic showing expected compartments recovered from uRNAs alone and the heterogeneous tumor/DCIS interface control. g, Spatial-example bridge showing the four concordant positive examples and the discordant ERBB2 control carried into Figure 5. Detailed five-gene SSS heatmaps, concordance placement and per-example statistics are shown only in Figure 5.</w:t>
       </w:r>
     </w:p>
     <w:p>

</xml_diff>

<commit_message>
Renumber Atera manuscript figures
</commit_message>
<xml_diff>
--- a/manuscripts/atera_urna_nature_methods/manuscript_draft.docx
+++ b/manuscripts/atera_urna_nature_methods/manuscript_draft.docx
@@ -111,7 +111,7 @@
         <w:spacing w:after="120"/>
       </w:pPr>
       <w:r>
-        <w:t>The Atera breast cancer dataset contains 170,057 detected cells and 18,028 genes in a human FFPE breast cancer section with annotated tumor, stromal, immune and rare epithelial compartments [9]. The transcript table contained 740,442,119 rows, including 738,289,569 gene rows. After applying a quality threshold of QV &gt;= 20, 624,095,990 gene transcripts remained. Of these, 122,716,153 transcripts were assigned to the UNASSIGNED cell identifier, representing 19.7% of high-quality gene transcripts (Fig. 4a).</w:t>
+        <w:t>The Atera breast cancer dataset contains 170,057 detected cells and 18,028 genes in a human FFPE breast cancer section with annotated tumor, stromal, immune and rare epithelial compartments [9]. The transcript table contained 740,442,119 rows, including 738,289,569 gene rows. After applying a quality threshold of QV &gt;= 20, 624,095,990 gene transcripts remained. Of these, 122,716,153 transcripts were assigned to the UNASSIGNED cell identifier, representing 19.7% of high-quality gene transcripts (Fig. 1a).</w:t>
       </w:r>
     </w:p>
     <w:p>
@@ -119,7 +119,7 @@
         <w:spacing w:after="120"/>
       </w:pPr>
       <w:r>
-        <w:t>The uRNA pool was broad rather than restricted to a few genes. At least one high-quality uRNA was detected for 18,023 of 18,028 genes, corresponding to 99.97% of the panel. The median gene-level uRNA fraction across the full panel was 0.160. The distribution was not uniform: highly expressed and spatially abundant genes such as CCND1, NHERF1, XBP1 and OR4F17 contributed hundreds of thousands of high-quality uRNAs, whereas many genes had lower but still non-zero uRNA support (Fig. 4c). This scale makes the dataset suitable for testing whether uRNAs retain gene-specific tissue structure.</w:t>
+        <w:t>The uRNA pool was broad rather than restricted to a few genes. At least one high-quality uRNA was detected for 18,023 of 18,028 genes, corresponding to 99.97% of the panel. The median gene-level uRNA fraction across the full panel was 0.160. The distribution was not uniform: highly expressed and spatially abundant genes such as CCND1, NHERF1, XBP1 and OR4F17 contributed hundreds of thousands of high-quality uRNAs, whereas many genes had lower but still non-zero uRNA support (Fig. 1c). This scale makes the dataset suitable for testing whether uRNAs retain gene-specific tissue structure.</w:t>
       </w:r>
     </w:p>
     <w:p>
@@ -127,7 +127,7 @@
         <w:spacing w:after="120"/>
       </w:pPr>
       <w:r>
-        <w:t>To avoid over-interpreting sparse genes, we selected the top 500 genes by high-quality uRNA count and added curated marker genes for interpretable breast cancer compartments. This produced 530 genes for uRNA-only COSTE analysis (Fig. 4b). For each gene, uRNA coordinates were treated as a separate spatial population, and COSTE computed SSS values between that gene population and each annotated cell group. Lower SSS indicates closer spatial proximity in the COSTE hierarchy. This design uses cell-group coordinates as reference landmarks but does not assign uRNAs to cells. Thus, all-panel summaries describe the 18,028 assayed genes, whereas COSTE and concordance results refer to the 530 analyzed genes.</w:t>
+        <w:t>To avoid over-interpreting sparse genes, we selected the top 500 genes by high-quality uRNA count and added curated marker genes for interpretable breast cancer compartments. This produced 530 genes for uRNA-only COSTE analysis (Fig. 1b). For each gene, uRNA coordinates were treated as a separate spatial population, and COSTE computed SSS values between that gene population and each annotated cell group. Lower SSS indicates closer spatial proximity in the COSTE hierarchy. This design uses cell-group coordinates as reference landmarks but does not assign uRNAs to cells. Thus, all-panel summaries describe the 18,028 assayed genes, whereas COSTE and concordance results refer to the 530 analyzed genes.</w:t>
       </w:r>
     </w:p>
     <w:p>
@@ -135,7 +135,7 @@
         <w:spacing w:after="120"/>
       </w:pPr>
       <w:r>
-        <w:t>The resulting uRNA-only best-cell-group calls were concentrated in expected high-density tissue compartments. Basal-like structured DCIS cells and CXCL14+ fibroblasts each were the closest cell group for 189 genes, followed by macrophages for 100 genes, endothelial cells for 16 genes and pericytes for 8 genes (Fig. 4d). This distribution indicates that uRNAs carry strong compartmental structure but also warns that high-density stromal and interface regions can dominate global uRNA topology.</w:t>
+        <w:t>The resulting uRNA-only best-cell-group calls were concentrated in expected high-density tissue compartments. Basal-like structured DCIS cells and CXCL14+ fibroblasts each were the closest cell group for 189 genes, followed by macrophages for 100 genes, endothelial cells for 16 genes and pericytes for 8 genes (Fig. 1d). This distribution indicates that uRNAs carry strong compartmental structure but also warns that high-density stromal and interface regions can dominate global uRNA topology.</w:t>
       </w:r>
     </w:p>
     <w:p>
@@ -151,7 +151,7 @@
         <w:spacing w:after="120"/>
       </w:pPr>
       <w:r>
-        <w:t>We next compared uRNA-only SSS profiles with all-transcript gene-to-cell SSS profiles previously generated from the same sample. Across the 530 analyzed genes, the median per-gene Spearman concordance was 0.649, with an interquartile range of 0.226 to 0.998 and a mean of 0.555 (Fig. 4e). Exact best-cell-group agreement between uRNA-only and all-transcript profiles occurred for 50.2% of genes. In total, 60.0% of genes had Spearman concordance &gt;= 0.5, 37.7% had concordance &gt;= 0.8 and 21.9% had concordance effectively equal to 1.0 (Fig. 4e).</w:t>
+        <w:t>We next compared uRNA-only SSS profiles with all-transcript gene-to-cell SSS profiles previously generated from the same sample. Across the 530 analyzed genes, the median per-gene Spearman concordance was 0.649, with an interquartile range of 0.226 to 0.998 and a mean of 0.555 (Fig. 1e). Exact best-cell-group agreement between uRNA-only and all-transcript profiles occurred for 50.2% of genes. In total, 60.0% of genes had Spearman concordance &gt;= 0.5, 37.7% had concordance &gt;= 0.8 and 21.9% had concordance effectively equal to 1.0 (Fig. 1e).</w:t>
       </w:r>
     </w:p>
     <w:p>
@@ -183,7 +183,7 @@
         <w:spacing w:after="120"/>
       </w:pPr>
       <w:r>
-        <w:t>Curated marker genes provided positive controls with interpretable expected compartments. The 11q13 marker group, including CCND1, ELOVL2, KCNJ3 and FGF19, localized to 11q13 invasive tumor cells in the uRNA-only SSS profiles. The median Spearman concordance between uRNA-only and all-transcript profiles for this marker group was 0.999, and all four genes matched the all-transcript best cell group (Fig. 4f).</w:t>
+        <w:t>Curated marker genes provided positive controls with interpretable expected compartments. The 11q13 marker group, including CCND1, ELOVL2, KCNJ3 and FGF19, localized to 11q13 invasive tumor cells in the uRNA-only SSS profiles. The median Spearman concordance between uRNA-only and all-transcript profiles for this marker group was 0.999, and all four genes matched the all-transcript best cell group (Fig. 1f).</w:t>
       </w:r>
     </w:p>
     <w:p>
@@ -215,7 +215,7 @@
         <w:spacing w:after="120"/>
       </w:pPr>
       <w:r>
-        <w:t>To verify that these COSTE proximity calls corresponded to real spatial arrangements rather than only matrix-level statistics, we generated local position maps for selected examples. The selection path first moved from the 18,028-gene panel to the 530-gene uRNA-only COSTE analysis, then to curated marker controls with interpretable expected compartments, and finally to four concordant positive examples plus one discordant boundary-sensitive control (Fig. 4b,f,g). A whole-section overview first marks the five sampled windows, and the corresponding zoom panels then show the true uRNA and cell-centroid positions (Fig. 5a-f). For CCND1, C1QA, JCHAIN and CDH5, the plotted uRNAs overlapped the corresponding 11q13 tumor, macrophage, plasma-cell and endothelial landmarks in 850-um windows chosen from the true transcript and cell-coordinate data. The same examples were highlighted in the uRNA-only SSS heatmap and global concordance distribution, showing that their local spatial patterns matched their low-SSS target cell groups and high all-transcript concordance (Fig. 5g-j). ERBB2 was included as a discordant example: its uRNAs were closest to CXCL14+ fibroblasts in the uRNA-only analysis, whereas its all-transcript profile favored basal-like structured DCIS cells (Fig. 4g and Fig. 5f-j).</w:t>
+        <w:t>To verify that these COSTE proximity calls corresponded to real spatial arrangements rather than only matrix-level statistics, we generated local position maps for selected examples. The selection path first moved from the 18,028-gene panel to the 530-gene uRNA-only COSTE analysis, then to curated marker controls with interpretable expected compartments, and finally to four concordant positive examples plus one discordant boundary-sensitive control (Fig. 1b,f,g). A whole-section overview first marks the five sampled windows, and the corresponding zoom panels then show the true uRNA and cell-centroid positions (Fig. 2a-f). For CCND1, C1QA, JCHAIN and CDH5, the plotted uRNAs overlapped the corresponding 11q13 tumor, macrophage, plasma-cell and endothelial landmarks in 850-um windows chosen from the true transcript and cell-coordinate data. The same examples were highlighted in the uRNA-only SSS heatmap and global concordance distribution, showing that their local spatial patterns matched their low-SSS target cell groups and high all-transcript concordance (Fig. 2g-j). ERBB2 was included as a discordant example: its uRNAs were closest to CXCL14+ fibroblasts in the uRNA-only analysis, whereas its all-transcript profile favored basal-like structured DCIS cells (Fig. 1g and Fig. 2f-j).</w:t>
       </w:r>
     </w:p>
     <w:p>
@@ -431,7 +431,7 @@
         <w:spacing w:after="120"/>
       </w:pPr>
       <w:r>
-        <w:t>Spatial example windows were extracted from the cached uRNA-coordinate parquet file generated on the A100 server. We selected CCND1, C1QA, JCHAIN and CDH5 as concordant examples and ERBB2 as a discordant example. For each gene, an 850-um square window was chosen by scoring grid bins for joint enrichment of the gene's uRNA coordinates and the target cell group. Target groups were 11q13 invasive tumor cells for CCND1, macrophages for C1QA, plasma cells for JCHAIN, endothelial cells for CDH5 and CXCL14+ fibroblasts for ERBB2. The Figure 5 overview uses a reproducible sample of 120,000 annotated cell centroids to show where the windows sit in the whole section. The zoom maps show true uRNA coordinates, true target cell centroids and sampled non-target cell centroids from each selected window. To maintain readability, uRNAs were downsampled to at most 7,000 plotted points per example and non-target cells to at most 3,500 plotted points; all target cells in the window were retained.</w:t>
+        <w:t>Spatial example windows were extracted from the cached uRNA-coordinate parquet file generated on the A100 server. We selected CCND1, C1QA, JCHAIN and CDH5 as concordant examples and ERBB2 as a discordant example. For each gene, an 850-um square window was chosen by scoring grid bins for joint enrichment of the gene's uRNA coordinates and the target cell group. Target groups were 11q13 invasive tumor cells for CCND1, macrophages for C1QA, plasma cells for JCHAIN, endothelial cells for CDH5 and CXCL14+ fibroblasts for ERBB2. The Figure 2 overview uses a reproducible sample of 120,000 annotated cell centroids to show where the windows sit in the whole section. The zoom maps show true uRNA coordinates, true target cell centroids and sampled non-target cell centroids from each selected window. To maintain readability, uRNAs were downsampled to at most 7,000 plotted points per example and non-target cells to at most 3,500 plotted points; all target cells in the window were retained.</w:t>
       </w:r>
     </w:p>
     <w:p>
@@ -543,7 +543,7 @@
         <w:pStyle w:val="Heading2"/>
       </w:pPr>
       <w:r>
-        <w:t>Figure 4. Integrated uRNA evidence chain before spatial validation</w:t>
+        <w:t>Figure 1. Integrated uRNA evidence chain before spatial validation</w:t>
       </w:r>
     </w:p>
     <w:p>
@@ -551,7 +551,7 @@
         <w:spacing w:after="120"/>
       </w:pPr>
       <w:r>
-        <w:t>a, Transcript counts through gene, quality and uRNA filtering. b, Analysis-set definition from the 18,028-gene panel to the 530 genes analyzed by uRNA-only COSTE and concordance. c, Distribution of gene-level uRNA fractions across all panel genes, with the 530 analyzed genes overlaid. d, uRNA-only best COSTE cell groups for the 530 analyzed genes. e, Compact summary of global concordance between uRNA-only and all-transcript SSS profiles across the 530 analyzed genes. f, Curated marker-control logic showing expected compartments recovered from uRNAs alone and the heterogeneous tumor/DCIS interface control. g, Spatial-example bridge showing the four concordant positive examples and the discordant ERBB2 control carried into Figure 5. Detailed five-gene SSS heatmaps, concordance placement and per-example statistics are shown only in Figure 5.</w:t>
+        <w:t>a, Transcript counts through gene, quality and uRNA filtering. b, Analysis-set definition from the 18,028-gene panel to the 530 genes analyzed by uRNA-only COSTE and concordance. c, Distribution of gene-level uRNA fractions across all panel genes, with the 530 analyzed genes overlaid. d, uRNA-only best COSTE cell groups for the 530 analyzed genes. e, Compact summary of global concordance between uRNA-only and all-transcript SSS profiles across the 530 analyzed genes. f, Curated marker-control logic showing expected compartments recovered from uRNAs alone and the heterogeneous tumor/DCIS interface control. g, Spatial-example bridge showing the four concordant positive examples and the discordant ERBB2 control carried into Figure 2. Detailed five-gene SSS heatmaps, concordance placement and per-example statistics are shown only in Figure 2.</w:t>
       </w:r>
     </w:p>
     <w:p>
@@ -559,7 +559,7 @@
         <w:pStyle w:val="Heading2"/>
       </w:pPr>
       <w:r>
-        <w:t>Figure 5. Real spatial examples support uRNA-only COSTE calls</w:t>
+        <w:t>Figure 2. Real spatial examples support uRNA-only COSTE calls</w:t>
       </w:r>
     </w:p>
     <w:p>

</xml_diff>